<commit_message>
updated dimensional instruments challenge
</commit_message>
<xml_diff>
--- a/challenges/dimensional_instruments_challenge/Dimensional Instruments Challenge.docx
+++ b/challenges/dimensional_instruments_challenge/Dimensional Instruments Challenge.docx
@@ -1,6 +1,6 @@
 
 <file path=word/document.xml><?xml version="1.0" encoding="utf-8"?>
-<w:document xmlns:wpc="http://schemas.microsoft.com/office/word/2010/wordprocessingCanvas" xmlns:cx="http://schemas.microsoft.com/office/drawing/2014/chartex" xmlns:cx1="http://schemas.microsoft.com/office/drawing/2015/9/8/chartex" xmlns:cx2="http://schemas.microsoft.com/office/drawing/2015/10/21/chartex" xmlns:cx3="http://schemas.microsoft.com/office/drawing/2016/5/9/chartex" xmlns:cx4="http://schemas.microsoft.com/office/drawing/2016/5/10/chartex" xmlns:cx5="http://schemas.microsoft.com/office/drawing/2016/5/11/chartex" xmlns:cx6="http://schemas.microsoft.com/office/drawing/2016/5/12/chartex" xmlns:cx7="http://schemas.microsoft.com/office/drawing/2016/5/13/chartex" xmlns:cx8="http://schemas.microsoft.com/office/drawing/2016/5/14/chartex" xmlns:mc="http://schemas.openxmlformats.org/markup-compatibility/2006" xmlns:aink="http://schemas.microsoft.com/office/drawing/2016/ink" xmlns:am3d="http://schemas.microsoft.com/office/drawing/2017/model3d" xmlns:o="urn:schemas-microsoft-com:office:office" xmlns:r="http://schemas.openxmlformats.org/officeDocument/2006/relationships" xmlns:m="http://schemas.openxmlformats.org/officeDocument/2006/math" xmlns:v="urn:schemas-microsoft-com:vml" xmlns:wp14="http://schemas.microsoft.com/office/word/2010/wordprocessingDrawing" xmlns:wp="http://schemas.openxmlformats.org/drawingml/2006/wordprocessingDrawing" xmlns:w10="urn:schemas-microsoft-com:office:word" xmlns:w="http://schemas.openxmlformats.org/wordprocessingml/2006/main" xmlns:w14="http://schemas.microsoft.com/office/word/2010/wordml" xmlns:w15="http://schemas.microsoft.com/office/word/2012/wordml" xmlns:w16cid="http://schemas.microsoft.com/office/word/2016/wordml/cid" xmlns:w16se="http://schemas.microsoft.com/office/word/2015/wordml/symex" xmlns:wpg="http://schemas.microsoft.com/office/word/2010/wordprocessingGroup" xmlns:wpi="http://schemas.microsoft.com/office/word/2010/wordprocessingInk" xmlns:wne="http://schemas.microsoft.com/office/word/2006/wordml" xmlns:wps="http://schemas.microsoft.com/office/word/2010/wordprocessingShape" mc:Ignorable="w14 w15 w16se w16cid wp14">
+<w:document xmlns:wpc="http://schemas.microsoft.com/office/word/2010/wordprocessingCanvas" xmlns:cx="http://schemas.microsoft.com/office/drawing/2014/chartex" xmlns:cx1="http://schemas.microsoft.com/office/drawing/2015/9/8/chartex" xmlns:cx2="http://schemas.microsoft.com/office/drawing/2015/10/21/chartex" xmlns:cx3="http://schemas.microsoft.com/office/drawing/2016/5/9/chartex" xmlns:cx4="http://schemas.microsoft.com/office/drawing/2016/5/10/chartex" xmlns:cx5="http://schemas.microsoft.com/office/drawing/2016/5/11/chartex" xmlns:cx6="http://schemas.microsoft.com/office/drawing/2016/5/12/chartex" xmlns:cx7="http://schemas.microsoft.com/office/drawing/2016/5/13/chartex" xmlns:cx8="http://schemas.microsoft.com/office/drawing/2016/5/14/chartex" xmlns:mc="http://schemas.openxmlformats.org/markup-compatibility/2006" xmlns:aink="http://schemas.microsoft.com/office/drawing/2016/ink" xmlns:am3d="http://schemas.microsoft.com/office/drawing/2017/model3d" xmlns:o="urn:schemas-microsoft-com:office:office" xmlns:r="http://schemas.openxmlformats.org/officeDocument/2006/relationships" xmlns:m="http://schemas.openxmlformats.org/officeDocument/2006/math" xmlns:v="urn:schemas-microsoft-com:vml" xmlns:wp14="http://schemas.microsoft.com/office/word/2010/wordprocessingDrawing" xmlns:wp="http://schemas.openxmlformats.org/drawingml/2006/wordprocessingDrawing" xmlns:w10="urn:schemas-microsoft-com:office:word" xmlns:w="http://schemas.openxmlformats.org/wordprocessingml/2006/main" xmlns:w14="http://schemas.microsoft.com/office/word/2010/wordml" xmlns:w15="http://schemas.microsoft.com/office/word/2012/wordml" xmlns:w16cex="http://schemas.microsoft.com/office/word/2018/wordml/cex" xmlns:w16cid="http://schemas.microsoft.com/office/word/2016/wordml/cid" xmlns:w16="http://schemas.microsoft.com/office/word/2018/wordml" xmlns:w16sdtdh="http://schemas.microsoft.com/office/word/2020/wordml/sdtdatahash" xmlns:w16se="http://schemas.microsoft.com/office/word/2015/wordml/symex" xmlns:wpg="http://schemas.microsoft.com/office/word/2010/wordprocessingGroup" xmlns:wpi="http://schemas.microsoft.com/office/word/2010/wordprocessingInk" xmlns:wne="http://schemas.microsoft.com/office/word/2006/wordml" xmlns:wps="http://schemas.microsoft.com/office/word/2010/wordprocessingShape" mc:Ignorable="w14 w15 w16se w16cid w16 w16cex w16sdtdh wp14">
   <w:body>
     <w:p>
       <w:pPr>
@@ -16,12 +16,7 @@
         <w:t>Challenge:</w:t>
       </w:r>
       <w:r>
-        <w:t xml:space="preserve"> Measure the needed</w:t>
-      </w:r>
-      <w:bookmarkStart w:id="0" w:name="_GoBack"/>
-      <w:bookmarkEnd w:id="0"/>
-      <w:r>
-        <w:t xml:space="preserve"> dimensions of the object provided, knowing that you will be recreating this object as a </w:t>
+        <w:t xml:space="preserve"> Measure the needed dimensions of the object provided, knowing that you will be recreating this object as a </w:t>
       </w:r>
       <w:r>
         <w:t xml:space="preserve">dimensioned </w:t>
@@ -94,6 +89,15 @@
       <w:r>
         <w:t>Report percent differences</w:t>
       </w:r>
+      <w:r>
+        <w:t xml:space="preserve"> and standard deviations for a population of </w:t>
+      </w:r>
+      <w:r>
+        <w:t xml:space="preserve">measured </w:t>
+      </w:r>
+      <w:r>
+        <w:t>data</w:t>
+      </w:r>
     </w:p>
     <w:p>
       <w:pPr>
@@ -264,7 +268,311 @@
         <w:t>s</w:t>
       </w:r>
       <w:r>
-        <w:t>. </w:t>
+        <w:t>.</w:t>
+      </w:r>
+    </w:p>
+    <w:p>
+      <w:pPr>
+        <w:pStyle w:val="NormalWeb"/>
+        <w:numPr>
+          <w:ilvl w:val="0"/>
+          <w:numId w:val="7"/>
+        </w:numPr>
+      </w:pPr>
+      <w:r>
+        <w:t xml:space="preserve">Zero the digital instruments </w:t>
+      </w:r>
+      <w:r>
+        <w:t>before taking measurements. See the equipment manuals or ask the TA</w:t>
+      </w:r>
+      <w:r>
+        <w:t xml:space="preserve"> for help.</w:t>
+      </w:r>
+    </w:p>
+    <w:p>
+      <w:pPr>
+        <w:pStyle w:val="NormalWeb"/>
+        <w:ind w:left="360"/>
+      </w:pPr>
+      <w:r>
+        <w:rPr>
+          <w:noProof/>
+        </w:rPr>
+        <mc:AlternateContent>
+          <mc:Choice Requires="wpc">
+            <w:drawing>
+              <wp:inline distT="0" distB="0" distL="0" distR="0" wp14:anchorId="1329CD5D" wp14:editId="04FEA5D7">
+                <wp:extent cx="4057650" cy="3200400"/>
+                <wp:effectExtent l="0" t="0" r="0" b="0"/>
+                <wp:docPr id="2" name="Canvas 2"/>
+                <wp:cNvGraphicFramePr>
+                  <a:graphicFrameLocks xmlns:a="http://schemas.openxmlformats.org/drawingml/2006/main" noChangeAspect="1"/>
+                </wp:cNvGraphicFramePr>
+                <a:graphic xmlns:a="http://schemas.openxmlformats.org/drawingml/2006/main">
+                  <a:graphicData uri="http://schemas.microsoft.com/office/word/2010/wordprocessingCanvas">
+                    <wpc:wpc>
+                      <wpc:bg>
+                        <a:solidFill>
+                          <a:prstClr val="white"/>
+                        </a:solidFill>
+                      </wpc:bg>
+                      <wpc:whole/>
+                      <pic:pic xmlns:pic="http://schemas.openxmlformats.org/drawingml/2006/picture">
+                        <pic:nvPicPr>
+                          <pic:cNvPr id="3" name="Picture 3"/>
+                          <pic:cNvPicPr/>
+                        </pic:nvPicPr>
+                        <pic:blipFill>
+                          <a:blip r:embed="rId10">
+                            <a:extLst>
+                              <a:ext uri="{28A0092B-C50C-407E-A947-70E740481C1C}">
+                                <a14:useLocalDpi xmlns:a14="http://schemas.microsoft.com/office/drawing/2010/main" val="0"/>
+                              </a:ext>
+                            </a:extLst>
+                          </a:blip>
+                          <a:srcRect/>
+                          <a:stretch>
+                            <a:fillRect/>
+                          </a:stretch>
+                        </pic:blipFill>
+                        <pic:spPr bwMode="auto">
+                          <a:xfrm>
+                            <a:off x="180000" y="180000"/>
+                            <a:ext cx="2953725" cy="2801325"/>
+                          </a:xfrm>
+                          <a:prstGeom prst="rect">
+                            <a:avLst/>
+                          </a:prstGeom>
+                          <a:noFill/>
+                          <a:ln>
+                            <a:noFill/>
+                          </a:ln>
+                        </pic:spPr>
+                      </pic:pic>
+                      <wps:wsp>
+                        <wps:cNvPr id="4" name="Text Box 4"/>
+                        <wps:cNvSpPr txBox="1"/>
+                        <wps:spPr>
+                          <a:xfrm>
+                            <a:off x="1754008" y="795378"/>
+                            <a:ext cx="200025" cy="247650"/>
+                          </a:xfrm>
+                          <a:prstGeom prst="rect">
+                            <a:avLst/>
+                          </a:prstGeom>
+                          <a:noFill/>
+                          <a:ln w="6350">
+                            <a:noFill/>
+                          </a:ln>
+                        </wps:spPr>
+                        <wps:txbx>
+                          <w:txbxContent>
+                            <w:p>
+                              <w:r>
+                                <w:t>B</w:t>
+                              </w:r>
+                            </w:p>
+                          </w:txbxContent>
+                        </wps:txbx>
+                        <wps:bodyPr rot="0" spcFirstLastPara="0" vertOverflow="overflow" horzOverflow="overflow" vert="horz" wrap="square" lIns="91440" tIns="45720" rIns="91440" bIns="45720" numCol="1" spcCol="0" rtlCol="0" fromWordArt="0" anchor="t" anchorCtr="0" forceAA="0" compatLnSpc="1">
+                          <a:prstTxWarp prst="textNoShape">
+                            <a:avLst/>
+                          </a:prstTxWarp>
+                          <a:noAutofit/>
+                        </wps:bodyPr>
+                      </wps:wsp>
+                      <wps:wsp>
+                        <wps:cNvPr id="5" name="Text Box 4"/>
+                        <wps:cNvSpPr txBox="1"/>
+                        <wps:spPr>
+                          <a:xfrm>
+                            <a:off x="1014886" y="1364744"/>
+                            <a:ext cx="265274" cy="247650"/>
+                          </a:xfrm>
+                          <a:prstGeom prst="rect">
+                            <a:avLst/>
+                          </a:prstGeom>
+                          <a:noFill/>
+                          <a:ln w="6350">
+                            <a:noFill/>
+                          </a:ln>
+                        </wps:spPr>
+                        <wps:txbx>
+                          <w:txbxContent>
+                            <w:p>
+                              <w:pPr>
+                                <w:spacing w:line="256" w:lineRule="auto"/>
+                                <w:rPr>
+                                  <w:rFonts w:ascii="Calibri" w:eastAsia="Calibri" w:hAnsi="Calibri"/>
+                                </w:rPr>
+                              </w:pPr>
+                              <w:r>
+                                <w:rPr>
+                                  <w:rFonts w:ascii="Calibri" w:eastAsia="Calibri" w:hAnsi="Calibri"/>
+                                </w:rPr>
+                                <w:t>W</w:t>
+                              </w:r>
+                            </w:p>
+                          </w:txbxContent>
+                        </wps:txbx>
+                        <wps:bodyPr rot="0" spcFirstLastPara="0" vert="horz" wrap="square" lIns="91440" tIns="45720" rIns="91440" bIns="45720" numCol="1" spcCol="0" rtlCol="0" fromWordArt="0" anchor="t" anchorCtr="0" forceAA="0" compatLnSpc="1">
+                          <a:prstTxWarp prst="textNoShape">
+                            <a:avLst/>
+                          </a:prstTxWarp>
+                          <a:noAutofit/>
+                        </wps:bodyPr>
+                      </wps:wsp>
+                      <wps:wsp>
+                        <wps:cNvPr id="6" name="Text Box 4"/>
+                        <wps:cNvSpPr txBox="1"/>
+                        <wps:spPr>
+                          <a:xfrm>
+                            <a:off x="299269" y="776347"/>
+                            <a:ext cx="200025" cy="247650"/>
+                          </a:xfrm>
+                          <a:prstGeom prst="rect">
+                            <a:avLst/>
+                          </a:prstGeom>
+                          <a:noFill/>
+                          <a:ln w="6350">
+                            <a:noFill/>
+                          </a:ln>
+                        </wps:spPr>
+                        <wps:txbx>
+                          <w:txbxContent>
+                            <w:p>
+                              <w:pPr>
+                                <w:spacing w:line="256" w:lineRule="auto"/>
+                                <w:rPr>
+                                  <w:rFonts w:ascii="Calibri" w:eastAsia="Calibri" w:hAnsi="Calibri"/>
+                                </w:rPr>
+                              </w:pPr>
+                              <w:r>
+                                <w:rPr>
+                                  <w:rFonts w:ascii="Calibri" w:eastAsia="Calibri" w:hAnsi="Calibri"/>
+                                </w:rPr>
+                                <w:t>H</w:t>
+                              </w:r>
+                            </w:p>
+                          </w:txbxContent>
+                        </wps:txbx>
+                        <wps:bodyPr rot="0" spcFirstLastPara="0" vert="horz" wrap="square" lIns="91440" tIns="45720" rIns="91440" bIns="45720" numCol="1" spcCol="0" rtlCol="0" fromWordArt="0" anchor="t" anchorCtr="0" forceAA="0" compatLnSpc="1">
+                          <a:prstTxWarp prst="textNoShape">
+                            <a:avLst/>
+                          </a:prstTxWarp>
+                          <a:noAutofit/>
+                        </wps:bodyPr>
+                      </wps:wsp>
+                    </wpc:wpc>
+                  </a:graphicData>
+                </a:graphic>
+              </wp:inline>
+            </w:drawing>
+          </mc:Choice>
+          <mc:Fallback>
+            <w:pict>
+              <v:group w14:anchorId="1329CD5D" id="Canvas 2" o:spid="_x0000_s1026" editas="canvas" style="width:319.5pt;height:252pt;mso-position-horizontal-relative:char;mso-position-vertical-relative:line" coordsize="40576,32004" o:gfxdata="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">
+                <v:shapetype id="_x0000_t75" coordsize="21600,21600" o:spt="75" o:preferrelative="t" path="m@4@5l@4@11@9@11@9@5xe" filled="f" stroked="f">
+                  <v:stroke joinstyle="miter"/>
+                  <v:formulas>
+                    <v:f eqn="if lineDrawn pixelLineWidth 0"/>
+                    <v:f eqn="sum @0 1 0"/>
+                    <v:f eqn="sum 0 0 @1"/>
+                    <v:f eqn="prod @2 1 2"/>
+                    <v:f eqn="prod @3 21600 pixelWidth"/>
+                    <v:f eqn="prod @3 21600 pixelHeight"/>
+                    <v:f eqn="sum @0 0 1"/>
+                    <v:f eqn="prod @6 1 2"/>
+                    <v:f eqn="prod @7 21600 pixelWidth"/>
+                    <v:f eqn="sum @8 21600 0"/>
+                    <v:f eqn="prod @7 21600 pixelHeight"/>
+                    <v:f eqn="sum @10 21600 0"/>
+                  </v:formulas>
+                  <v:path o:extrusionok="f" gradientshapeok="t" o:connecttype="rect"/>
+                  <o:lock v:ext="edit" aspectratio="t"/>
+                </v:shapetype>
+                <v:shape id="_x0000_s1027" type="#_x0000_t75" style="position:absolute;width:40576;height:32004;visibility:visible;mso-wrap-style:square" filled="t">
+                  <v:fill o:detectmouseclick="t"/>
+                  <v:path o:connecttype="none"/>
+                </v:shape>
+                <v:shape id="Picture 3" o:spid="_x0000_s1028" type="#_x0000_t75" style="position:absolute;left:1800;top:1800;width:29537;height:28013;visibility:visible;mso-wrap-style:square" o:gfxdata="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">
+                  <v:imagedata r:id="rId11" o:title=""/>
+                </v:shape>
+                <v:shapetype id="_x0000_t202" coordsize="21600,21600" o:spt="202" path="m,l,21600r21600,l21600,xe">
+                  <v:stroke joinstyle="miter"/>
+                  <v:path gradientshapeok="t" o:connecttype="rect"/>
+                </v:shapetype>
+                <v:shape id="Text Box 4" o:spid="_x0000_s1029" type="#_x0000_t202" style="position:absolute;left:17540;top:7953;width:2000;height:2477;visibility:visible;mso-wrap-style:square;v-text-anchor:top" o:gfxdata="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" filled="f" stroked="f" strokeweight=".5pt">
+                  <v:textbox>
+                    <w:txbxContent>
+                      <w:p>
+                        <w:r>
+                          <w:t>B</w:t>
+                        </w:r>
+                      </w:p>
+                    </w:txbxContent>
+                  </v:textbox>
+                </v:shape>
+                <v:shape id="Text Box 4" o:spid="_x0000_s1030" type="#_x0000_t202" style="position:absolute;left:10148;top:13647;width:2653;height:2476;visibility:visible;mso-wrap-style:square;v-text-anchor:top" o:gfxdata="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" filled="f" stroked="f" strokeweight=".5pt">
+                  <v:textbox>
+                    <w:txbxContent>
+                      <w:p>
+                        <w:pPr>
+                          <w:spacing w:line="256" w:lineRule="auto"/>
+                          <w:rPr>
+                            <w:rFonts w:ascii="Calibri" w:eastAsia="Calibri" w:hAnsi="Calibri"/>
+                          </w:rPr>
+                        </w:pPr>
+                        <w:r>
+                          <w:rPr>
+                            <w:rFonts w:ascii="Calibri" w:eastAsia="Calibri" w:hAnsi="Calibri"/>
+                          </w:rPr>
+                          <w:t>W</w:t>
+                        </w:r>
+                      </w:p>
+                    </w:txbxContent>
+                  </v:textbox>
+                </v:shape>
+                <v:shape id="Text Box 4" o:spid="_x0000_s1031" type="#_x0000_t202" style="position:absolute;left:2992;top:7763;width:2000;height:2476;visibility:visible;mso-wrap-style:square;v-text-anchor:top" o:gfxdata="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" filled="f" stroked="f" strokeweight=".5pt">
+                  <v:textbox>
+                    <w:txbxContent>
+                      <w:p>
+                        <w:pPr>
+                          <w:spacing w:line="256" w:lineRule="auto"/>
+                          <w:rPr>
+                            <w:rFonts w:ascii="Calibri" w:eastAsia="Calibri" w:hAnsi="Calibri"/>
+                          </w:rPr>
+                        </w:pPr>
+                        <w:r>
+                          <w:rPr>
+                            <w:rFonts w:ascii="Calibri" w:eastAsia="Calibri" w:hAnsi="Calibri"/>
+                          </w:rPr>
+                          <w:t>H</w:t>
+                        </w:r>
+                      </w:p>
+                    </w:txbxContent>
+                  </v:textbox>
+                </v:shape>
+                <w10:anchorlock/>
+              </v:group>
+            </w:pict>
+          </mc:Fallback>
+        </mc:AlternateContent>
+      </w:r>
+    </w:p>
+    <w:p>
+      <w:pPr>
+        <w:pStyle w:val="NormalWeb"/>
+        <w:ind w:left="360"/>
+      </w:pPr>
+      <w:r>
+        <w:t>F</w:t>
+      </w:r>
+      <w:r>
+        <w:t>igure 1 - NEMA Stepper Dimensions</w:t>
+      </w:r>
+      <w:r>
+        <w:t> </w:t>
       </w:r>
     </w:p>
     <w:p>
@@ -278,6 +586,7 @@
         <w:rPr>
           <w:b/>
         </w:rPr>
+        <w:lastRenderedPageBreak/>
         <w:t xml:space="preserve">Lab </w:t>
       </w:r>
       <w:r>
@@ -296,8 +605,298 @@
         </w:numPr>
       </w:pPr>
       <w:r>
-        <w:t>You will be deciding what dimensional measurements of the object’s features that you will need to make while in lab.</w:t>
-      </w:r>
+        <w:t xml:space="preserve">Measure </w:t>
+      </w:r>
+      <w:r>
+        <w:t>the width (W), and height (H)</w:t>
+      </w:r>
+      <w:r>
+        <w:t>, bolt spacing (B)</w:t>
+      </w:r>
+      <w:r>
+        <w:t xml:space="preserve"> </w:t>
+      </w:r>
+      <w:r>
+        <w:t xml:space="preserve">dimensions </w:t>
+      </w:r>
+      <w:r>
+        <w:t>of the objec</w:t>
+      </w:r>
+      <w:r>
+        <w:t xml:space="preserve">t as shown in </w:t>
+      </w:r>
+      <w:r>
+        <w:t>F</w:t>
+      </w:r>
+      <w:r>
+        <w:t>igure 1.</w:t>
+      </w:r>
+      <w:r>
+        <w:t xml:space="preserve"> Choose two additional </w:t>
+      </w:r>
+      <w:r>
+        <w:t xml:space="preserve">features on the object to measure </w:t>
+      </w:r>
+      <w:r>
+        <w:t xml:space="preserve">for a total of five separate </w:t>
+      </w:r>
+      <w:r>
+        <w:t>measured features</w:t>
+      </w:r>
+      <w:r>
+        <w:t xml:space="preserve"> on the object</w:t>
+      </w:r>
+      <w:r>
+        <w:t>.</w:t>
+      </w:r>
+    </w:p>
+    <w:p>
+      <w:pPr>
+        <w:pStyle w:val="NormalWeb"/>
+        <w:numPr>
+          <w:ilvl w:val="0"/>
+          <w:numId w:val="13"/>
+        </w:numPr>
+      </w:pPr>
+      <w:r>
+        <w:t xml:space="preserve">Collect </w:t>
+      </w:r>
+      <w:r>
+        <w:t>5</w:t>
+      </w:r>
+      <w:r>
+        <w:t xml:space="preserve"> separate </w:t>
+      </w:r>
+      <w:r>
+        <w:t>measurements</w:t>
+      </w:r>
+      <w:r>
+        <w:t xml:space="preserve"> </w:t>
+      </w:r>
+      <w:r>
+        <w:t xml:space="preserve">of each feature </w:t>
+      </w:r>
+      <w:r>
+        <w:t>with two different instrument types</w:t>
+      </w:r>
+      <w:r>
+        <w:t xml:space="preserve"> for a total of </w:t>
+      </w:r>
+      <w:r>
+        <w:t>10 readings per feature.</w:t>
+      </w:r>
+      <w:r>
+        <w:t xml:space="preserve"> Available instruments include </w:t>
+      </w:r>
+      <w:r>
+        <w:t xml:space="preserve">digital caliper, Vernier caliper, </w:t>
+      </w:r>
+      <w:r>
+        <w:t>ruler, digital micrometer, Vernier micrometer.</w:t>
+      </w:r>
+    </w:p>
+    <w:p>
+      <w:pPr>
+        <w:pStyle w:val="NormalWeb"/>
+        <w:numPr>
+          <w:ilvl w:val="0"/>
+          <w:numId w:val="13"/>
+        </w:numPr>
+      </w:pPr>
+      <w:r>
+        <w:t>P</w:t>
+      </w:r>
+      <w:r>
+        <w:t>repare a</w:t>
+      </w:r>
+      <w:r>
+        <w:t>n Excel</w:t>
+      </w:r>
+      <w:r>
+        <w:t xml:space="preserve"> spreadsheet </w:t>
+      </w:r>
+      <w:r>
+        <w:t>containing all</w:t>
+      </w:r>
+      <w:r>
+        <w:t xml:space="preserve"> </w:t>
+      </w:r>
+      <w:r>
+        <w:t xml:space="preserve">measurements </w:t>
+      </w:r>
+      <w:r>
+        <w:t xml:space="preserve">from both instruments for </w:t>
+      </w:r>
+      <w:r>
+        <w:t>each dimension</w:t>
+      </w:r>
+      <w:r>
+        <w:t xml:space="preserve"> and </w:t>
+      </w:r>
+      <w:r>
+        <w:t>instruments</w:t>
+      </w:r>
+      <w:r>
+        <w:t xml:space="preserve"> </w:t>
+      </w:r>
+      <w:r>
+        <w:t>(</w:t>
+      </w:r>
+      <w:r>
+        <w:t>rule</w:t>
+      </w:r>
+      <w:r>
+        <w:t>r</w:t>
+      </w:r>
+      <w:r>
+        <w:t xml:space="preserve"> and </w:t>
+      </w:r>
+      <w:r>
+        <w:t xml:space="preserve">Vernier </w:t>
+      </w:r>
+      <w:r>
+        <w:t xml:space="preserve">caliper </w:t>
+      </w:r>
+      <w:r>
+        <w:t>OR ruler and</w:t>
+      </w:r>
+      <w:r>
+        <w:t xml:space="preserve"> digital caliper</w:t>
+      </w:r>
+      <w:r>
+        <w:t>)</w:t>
+      </w:r>
+      <w:r>
+        <w:t>. </w:t>
+      </w:r>
+      <w:r>
+        <w:t>Be sure to indicate UNITS!</w:t>
+      </w:r>
+    </w:p>
+    <w:p>
+      <w:pPr>
+        <w:pStyle w:val="NormalWeb"/>
+        <w:ind w:left="1440"/>
+      </w:pPr>
+      <w:r>
+        <w:t>For example:</w:t>
+      </w:r>
+    </w:p>
+    <w:p>
+      <w:pPr>
+        <w:pStyle w:val="NormalWeb"/>
+        <w:ind w:left="1440"/>
+        <w:contextualSpacing/>
+      </w:pPr>
+      <w:r>
+        <w:t xml:space="preserve">Object </w:t>
+      </w:r>
+      <w:r>
+        <w:tab/>
+        <w:t>Dimension</w:t>
+      </w:r>
+      <w:r>
+        <w:tab/>
+        <w:t>Instrument 1</w:t>
+      </w:r>
+      <w:r>
+        <w:tab/>
+      </w:r>
+      <w:r>
+        <w:tab/>
+        <w:t>Instrument 2</w:t>
+      </w:r>
+    </w:p>
+    <w:p>
+      <w:pPr>
+        <w:pStyle w:val="NormalWeb"/>
+        <w:ind w:left="1440"/>
+        <w:contextualSpacing/>
+      </w:pPr>
+      <w:r>
+        <w:tab/>
+      </w:r>
+      <w:r>
+        <w:tab/>
+      </w:r>
+      <w:r>
+        <w:tab/>
+      </w:r>
+      <w:r>
+        <w:tab/>
+        <w:t>Reading 1</w:t>
+      </w:r>
+      <w:r>
+        <w:tab/>
+      </w:r>
+      <w:r>
+        <w:tab/>
+        <w:t>Reading 1</w:t>
+      </w:r>
+    </w:p>
+    <w:p>
+      <w:pPr>
+        <w:pStyle w:val="NormalWeb"/>
+        <w:ind w:left="1440"/>
+        <w:contextualSpacing/>
+      </w:pPr>
+      <w:r>
+        <w:tab/>
+      </w:r>
+      <w:r>
+        <w:tab/>
+      </w:r>
+      <w:r>
+        <w:tab/>
+      </w:r>
+      <w:r>
+        <w:tab/>
+        <w:t>…</w:t>
+      </w:r>
+      <w:r>
+        <w:tab/>
+      </w:r>
+      <w:r>
+        <w:tab/>
+      </w:r>
+      <w:r>
+        <w:tab/>
+        <w:t>…</w:t>
+      </w:r>
+    </w:p>
+    <w:p>
+      <w:pPr>
+        <w:pStyle w:val="NormalWeb"/>
+        <w:ind w:left="1440"/>
+        <w:contextualSpacing/>
+      </w:pPr>
+      <w:r>
+        <w:tab/>
+      </w:r>
+      <w:r>
+        <w:tab/>
+      </w:r>
+      <w:r>
+        <w:tab/>
+      </w:r>
+      <w:r>
+        <w:tab/>
+        <w:t>Reading 5</w:t>
+      </w:r>
+      <w:r>
+        <w:tab/>
+      </w:r>
+      <w:r>
+        <w:tab/>
+        <w:t>Reading 5</w:t>
+      </w:r>
+    </w:p>
+    <w:p>
+      <w:pPr>
+        <w:pStyle w:val="NormalWeb"/>
+        <w:ind w:left="1440"/>
+        <w:contextualSpacing/>
+      </w:pPr>
     </w:p>
     <w:p>
       <w:pPr>
@@ -308,187 +907,7 @@
         </w:numPr>
       </w:pPr>
       <w:r>
-        <w:t>P</w:t>
-      </w:r>
-      <w:r>
-        <w:t>repare a</w:t>
-      </w:r>
-      <w:r>
-        <w:t>n Excel</w:t>
-      </w:r>
-      <w:r>
-        <w:t xml:space="preserve"> spreadsheet with five distinct repeat readings of each required dimension, using two distinct instruments</w:t>
-      </w:r>
-      <w:r>
-        <w:t xml:space="preserve"> </w:t>
-      </w:r>
-      <w:r>
-        <w:t>(</w:t>
-      </w:r>
-      <w:r>
-        <w:t>rule</w:t>
-      </w:r>
-      <w:r>
-        <w:t>r</w:t>
-      </w:r>
-      <w:r>
-        <w:t xml:space="preserve"> and </w:t>
-      </w:r>
-      <w:r>
-        <w:t xml:space="preserve">Vernier </w:t>
-      </w:r>
-      <w:r>
-        <w:t xml:space="preserve">caliper </w:t>
-      </w:r>
-      <w:r>
-        <w:t>OR ruler and</w:t>
-      </w:r>
-      <w:r>
-        <w:t xml:space="preserve"> digital caliper</w:t>
-      </w:r>
-      <w:r>
-        <w:t>)</w:t>
-      </w:r>
-      <w:r>
-        <w:t>. </w:t>
-      </w:r>
-      <w:r>
-        <w:t>Be sure to indicate UNITS!</w:t>
-      </w:r>
-    </w:p>
-    <w:p>
-      <w:pPr>
-        <w:pStyle w:val="NormalWeb"/>
-        <w:ind w:left="1440"/>
-      </w:pPr>
-      <w:r>
-        <w:t>For example:</w:t>
-      </w:r>
-    </w:p>
-    <w:p>
-      <w:pPr>
-        <w:pStyle w:val="NormalWeb"/>
-        <w:ind w:left="1440"/>
-        <w:contextualSpacing/>
-      </w:pPr>
-      <w:r>
-        <w:t xml:space="preserve">Object </w:t>
-      </w:r>
-      <w:r>
-        <w:tab/>
-        <w:t>Dimension</w:t>
-      </w:r>
-      <w:r>
-        <w:tab/>
-        <w:t>Instrument 1</w:t>
-      </w:r>
-      <w:r>
-        <w:tab/>
-      </w:r>
-      <w:r>
-        <w:tab/>
-        <w:t>Instrument 2</w:t>
-      </w:r>
-    </w:p>
-    <w:p>
-      <w:pPr>
-        <w:pStyle w:val="NormalWeb"/>
-        <w:ind w:left="1440"/>
-        <w:contextualSpacing/>
-      </w:pPr>
-      <w:r>
-        <w:tab/>
-      </w:r>
-      <w:r>
-        <w:tab/>
-      </w:r>
-      <w:r>
-        <w:tab/>
-      </w:r>
-      <w:r>
-        <w:tab/>
-        <w:t>Reading 1</w:t>
-      </w:r>
-      <w:r>
-        <w:tab/>
-      </w:r>
-      <w:r>
-        <w:tab/>
-        <w:t>Reading 1</w:t>
-      </w:r>
-    </w:p>
-    <w:p>
-      <w:pPr>
-        <w:pStyle w:val="NormalWeb"/>
-        <w:ind w:left="1440"/>
-        <w:contextualSpacing/>
-      </w:pPr>
-      <w:r>
-        <w:tab/>
-      </w:r>
-      <w:r>
-        <w:tab/>
-      </w:r>
-      <w:r>
-        <w:tab/>
-      </w:r>
-      <w:r>
-        <w:tab/>
-        <w:t>…</w:t>
-      </w:r>
-      <w:r>
-        <w:tab/>
-      </w:r>
-      <w:r>
-        <w:tab/>
-      </w:r>
-      <w:r>
-        <w:tab/>
-        <w:t>…</w:t>
-      </w:r>
-    </w:p>
-    <w:p>
-      <w:pPr>
-        <w:pStyle w:val="NormalWeb"/>
-        <w:ind w:left="1440"/>
-        <w:contextualSpacing/>
-      </w:pPr>
-      <w:r>
-        <w:tab/>
-      </w:r>
-      <w:r>
-        <w:tab/>
-      </w:r>
-      <w:r>
-        <w:tab/>
-      </w:r>
-      <w:r>
-        <w:tab/>
-        <w:t>Reading 5</w:t>
-      </w:r>
-      <w:r>
-        <w:tab/>
-      </w:r>
-      <w:r>
-        <w:tab/>
-        <w:t>Reading 5</w:t>
-      </w:r>
-    </w:p>
-    <w:p>
-      <w:pPr>
-        <w:pStyle w:val="NormalWeb"/>
-      </w:pPr>
-    </w:p>
-    <w:p>
-      <w:pPr>
-        <w:pStyle w:val="NormalWeb"/>
-        <w:numPr>
-          <w:ilvl w:val="0"/>
-          <w:numId w:val="8"/>
-        </w:numPr>
-      </w:pPr>
-      <w:r>
-        <w:t>A</w:t>
+        <w:t>To randomize the test, a</w:t>
       </w:r>
       <w:r>
         <w:t>lternate us</w:t>
@@ -497,10 +916,10 @@
         <w:t xml:space="preserve">e of the instruments (read dimension 1 </w:t>
       </w:r>
       <w:r>
-        <w:t xml:space="preserve">using instrument 1, reset the instrument to </w:t>
-      </w:r>
-      <w:r>
-        <w:t>zero THEN read</w:t>
+        <w:t xml:space="preserve">using instrument 1, </w:t>
+      </w:r>
+      <w:r>
+        <w:t>THEN read</w:t>
       </w:r>
       <w:r>
         <w:t xml:space="preserve"> dimension </w:t>
@@ -527,13 +946,119 @@
           <w:b/>
         </w:rPr>
       </w:pPr>
-    </w:p>
-    <w:p>
-      <w:pPr>
-        <w:pStyle w:val="NormalWeb"/>
+      <w:r>
         <w:rPr>
           <w:b/>
         </w:rPr>
+        <w:t>Data</w:t>
+      </w:r>
+      <w:r>
+        <w:rPr>
+          <w:b/>
+        </w:rPr>
+        <w:t xml:space="preserve"> </w:t>
+      </w:r>
+      <w:r>
+        <w:rPr>
+          <w:b/>
+        </w:rPr>
+        <w:t>Analysi</w:t>
+      </w:r>
+      <w:r>
+        <w:rPr>
+          <w:b/>
+        </w:rPr>
+        <w:t>s</w:t>
+      </w:r>
+      <w:r>
+        <w:rPr>
+          <w:b/>
+        </w:rPr>
+        <w:t>: </w:t>
+      </w:r>
+    </w:p>
+    <w:p>
+      <w:pPr>
+        <w:pStyle w:val="NormalWeb"/>
+        <w:numPr>
+          <w:ilvl w:val="0"/>
+          <w:numId w:val="5"/>
+        </w:numPr>
+      </w:pPr>
+      <w:r>
+        <w:t xml:space="preserve">In the </w:t>
+      </w:r>
+      <w:r>
+        <w:t>spreadsheet, calculate the mean and the standard deviation for each dimension from the five readings entered for each instrument</w:t>
+      </w:r>
+      <w:r>
+        <w:t>.</w:t>
+      </w:r>
+    </w:p>
+    <w:p>
+      <w:pPr>
+        <w:pStyle w:val="NormalWeb"/>
+        <w:numPr>
+          <w:ilvl w:val="0"/>
+          <w:numId w:val="5"/>
+        </w:numPr>
+      </w:pPr>
+      <w:r>
+        <w:t xml:space="preserve">Determine the percent difference between readings </w:t>
+      </w:r>
+      <w:r>
+        <w:t xml:space="preserve">on a given dimension </w:t>
+      </w:r>
+      <w:r>
+        <w:t>using the two instruments</w:t>
+      </w:r>
+      <w:r>
+        <w:t>.</w:t>
+      </w:r>
+    </w:p>
+    <w:p>
+      <w:pPr>
+        <w:pStyle w:val="NormalWeb"/>
+      </w:pPr>
+    </w:p>
+    <w:p>
+      <w:pPr>
+        <w:pStyle w:val="NormalWeb"/>
+      </w:pPr>
+    </w:p>
+    <w:p>
+      <w:pPr>
+        <w:pStyle w:val="NormalWeb"/>
+      </w:pPr>
+    </w:p>
+    <w:p>
+      <w:pPr>
+        <w:pStyle w:val="NormalWeb"/>
+      </w:pPr>
+    </w:p>
+    <w:p>
+      <w:pPr>
+        <w:pStyle w:val="NormalWeb"/>
+      </w:pPr>
+    </w:p>
+    <w:p>
+      <w:pPr>
+        <w:pStyle w:val="NormalWeb"/>
+      </w:pPr>
+    </w:p>
+    <w:p>
+      <w:pPr>
+        <w:pStyle w:val="NormalWeb"/>
+      </w:pPr>
+    </w:p>
+    <w:p>
+      <w:pPr>
+        <w:pStyle w:val="NormalWeb"/>
+      </w:pPr>
+    </w:p>
+    <w:p>
+      <w:pPr>
+        <w:pStyle w:val="NormalWeb"/>
       </w:pPr>
     </w:p>
     <w:p>
@@ -548,31 +1073,40 @@
           <w:b/>
         </w:rPr>
         <w:lastRenderedPageBreak/>
-        <w:t>Data</w:t>
-      </w:r>
-      <w:r>
-        <w:rPr>
-          <w:b/>
-        </w:rPr>
-        <w:t xml:space="preserve"> </w:t>
-      </w:r>
-      <w:r>
-        <w:rPr>
-          <w:b/>
-        </w:rPr>
-        <w:t>Analysi</w:t>
-      </w:r>
-      <w:r>
-        <w:rPr>
-          <w:b/>
-        </w:rPr>
-        <w:t>s</w:t>
-      </w:r>
-      <w:r>
-        <w:rPr>
-          <w:b/>
-        </w:rPr>
-        <w:t>: </w:t>
+        <w:t>Deliverables: </w:t>
+      </w:r>
+    </w:p>
+    <w:p>
+      <w:pPr>
+        <w:pStyle w:val="NormalWeb"/>
+      </w:pPr>
+      <w:r>
+        <w:t>Upload</w:t>
+      </w:r>
+      <w:r>
+        <w:t xml:space="preserve"> the Challenge Report by the deadline, uploading to </w:t>
+      </w:r>
+      <w:proofErr w:type="spellStart"/>
+      <w:r>
+        <w:t>iLearn</w:t>
+      </w:r>
+      <w:proofErr w:type="spellEnd"/>
+      <w:r>
+        <w:t xml:space="preserve"> as two files</w:t>
+      </w:r>
+    </w:p>
+    <w:p>
+      <w:pPr>
+        <w:pStyle w:val="NormalWeb"/>
+      </w:pPr>
+      <w:r>
+        <w:t>(a) Fully annotated spreadsheet</w:t>
+      </w:r>
+      <w:r>
+        <w:t xml:space="preserve"> file</w:t>
+      </w:r>
+      <w:r>
+        <w:t xml:space="preserve">: </w:t>
       </w:r>
     </w:p>
     <w:p>
@@ -580,17 +1114,23 @@
         <w:pStyle w:val="NormalWeb"/>
         <w:numPr>
           <w:ilvl w:val="0"/>
-          <w:numId w:val="5"/>
+          <w:numId w:val="14"/>
         </w:numPr>
       </w:pPr>
       <w:r>
-        <w:t xml:space="preserve">In the </w:t>
-      </w:r>
-      <w:r>
-        <w:t>spreadsheet, calculate the mean and the standard deviation for each dimension from the five readings entered for each instrument</w:t>
-      </w:r>
-      <w:r>
-        <w:t>.</w:t>
+        <w:t xml:space="preserve">Provide a spreadsheet file in Excel to document </w:t>
+      </w:r>
+      <w:r>
+        <w:t xml:space="preserve">your </w:t>
+      </w:r>
+      <w:r>
+        <w:t xml:space="preserve">raw data and </w:t>
+      </w:r>
+      <w:r>
+        <w:t xml:space="preserve">your </w:t>
+      </w:r>
+      <w:r>
+        <w:t>data analysis </w:t>
       </w:r>
     </w:p>
     <w:p>
@@ -598,188 +1138,120 @@
         <w:pStyle w:val="NormalWeb"/>
         <w:numPr>
           <w:ilvl w:val="0"/>
-          <w:numId w:val="5"/>
+          <w:numId w:val="14"/>
         </w:numPr>
       </w:pPr>
       <w:r>
-        <w:t xml:space="preserve">Determine the percent difference between readings </w:t>
-      </w:r>
-      <w:r>
-        <w:t xml:space="preserve">on a given dimension </w:t>
-      </w:r>
-      <w:r>
-        <w:t>using the two instruments</w:t>
-      </w:r>
-      <w:r>
-        <w:t>.</w:t>
-      </w:r>
-    </w:p>
-    <w:p>
-      <w:pPr>
-        <w:pStyle w:val="NormalWeb"/>
-        <w:rPr>
-          <w:b/>
-        </w:rPr>
-      </w:pPr>
-      <w:r>
-        <w:rPr>
-          <w:b/>
-        </w:rPr>
-        <w:t>Deliverables: </w:t>
-      </w:r>
-    </w:p>
-    <w:p>
-      <w:pPr>
-        <w:pStyle w:val="NormalWeb"/>
-      </w:pPr>
-      <w:r>
-        <w:t>Upload</w:t>
-      </w:r>
-      <w:r>
-        <w:t xml:space="preserve"> the Challenge Report by the deadline, uploading to </w:t>
+        <w:t>Be sure to use text blocks in the Excel file to annotate your work</w:t>
+      </w:r>
+    </w:p>
+    <w:p>
+      <w:pPr>
+        <w:pStyle w:val="NormalWeb"/>
+        <w:numPr>
+          <w:ilvl w:val="0"/>
+          <w:numId w:val="14"/>
+        </w:numPr>
+      </w:pPr>
+      <w:r>
+        <w:t xml:space="preserve">For </w:t>
+      </w:r>
+      <w:r>
+        <w:t>example,</w:t>
+      </w:r>
+      <w:r>
+        <w:t xml:space="preserve"> if you are using a formula, show the formula</w:t>
+      </w:r>
+    </w:p>
+    <w:p>
+      <w:pPr>
+        <w:pStyle w:val="NormalWeb"/>
+      </w:pPr>
+      <w:r>
+        <w:t>(b) Working Notes (PDF). </w:t>
+      </w:r>
+    </w:p>
+    <w:p>
+      <w:pPr>
+        <w:pStyle w:val="NormalWeb"/>
+        <w:numPr>
+          <w:ilvl w:val="0"/>
+          <w:numId w:val="15"/>
+        </w:numPr>
+      </w:pPr>
+      <w:r>
+        <w:t xml:space="preserve">Document </w:t>
+      </w:r>
+      <w:r>
+        <w:t xml:space="preserve">your </w:t>
+      </w:r>
+      <w:r>
+        <w:t>procedures in a Working Notes file, uploaded as a PDF.</w:t>
+      </w:r>
+    </w:p>
+    <w:p>
+      <w:pPr>
+        <w:pStyle w:val="NormalWeb"/>
+        <w:numPr>
+          <w:ilvl w:val="0"/>
+          <w:numId w:val="15"/>
+        </w:numPr>
+      </w:pPr>
+      <w:r>
+        <w:t>S</w:t>
+      </w:r>
+      <w:r>
+        <w:t xml:space="preserve">how photos </w:t>
+      </w:r>
+      <w:r>
+        <w:t xml:space="preserve">and/or sketches </w:t>
+      </w:r>
+      <w:r>
+        <w:t>of your work</w:t>
+      </w:r>
+    </w:p>
+    <w:p>
+      <w:pPr>
+        <w:pStyle w:val="NormalWeb"/>
+        <w:numPr>
+          <w:ilvl w:val="0"/>
+          <w:numId w:val="15"/>
+        </w:numPr>
+      </w:pPr>
+      <w:r>
+        <w:t>Provide written notes of how you did the work</w:t>
+      </w:r>
+    </w:p>
+    <w:p>
+      <w:pPr>
+        <w:pStyle w:val="NormalWeb"/>
+        <w:numPr>
+          <w:ilvl w:val="0"/>
+          <w:numId w:val="15"/>
+        </w:numPr>
+      </w:pPr>
+      <w:r>
+        <w:t>Include observations of your work</w:t>
+      </w:r>
+      <w:r>
+        <w:t xml:space="preserve"> </w:t>
+      </w:r>
+      <w:r>
+        <w:t xml:space="preserve">such as if you had difficulty with something, what did you do to resolve the issue, what kinds of troubleshooting did you undertake, </w:t>
       </w:r>
       <w:proofErr w:type="spellStart"/>
       <w:r>
-        <w:t>iLearn</w:t>
+        <w:t>etc</w:t>
       </w:r>
       <w:proofErr w:type="spellEnd"/>
-      <w:r>
-        <w:t xml:space="preserve"> as two files</w:t>
-      </w:r>
-    </w:p>
-    <w:p>
-      <w:pPr>
-        <w:pStyle w:val="NormalWeb"/>
-      </w:pPr>
-      <w:r>
-        <w:t>(a) Fully annotated spreadsheet</w:t>
-      </w:r>
-      <w:r>
-        <w:t xml:space="preserve"> file</w:t>
-      </w:r>
-      <w:r>
-        <w:t xml:space="preserve">: </w:t>
-      </w:r>
-    </w:p>
-    <w:p>
-      <w:pPr>
-        <w:pStyle w:val="NormalWeb"/>
-        <w:ind w:left="720"/>
-      </w:pPr>
-      <w:r>
-        <w:t xml:space="preserve">Provide a spreadsheet file in Excel to document </w:t>
-      </w:r>
-      <w:r>
-        <w:t xml:space="preserve">your </w:t>
-      </w:r>
-      <w:r>
-        <w:t xml:space="preserve">raw data and </w:t>
-      </w:r>
-      <w:r>
-        <w:t xml:space="preserve">your </w:t>
-      </w:r>
-      <w:r>
-        <w:t>data analysis </w:t>
-      </w:r>
-    </w:p>
-    <w:p>
-      <w:pPr>
-        <w:pStyle w:val="NormalWeb"/>
-        <w:ind w:left="720"/>
-      </w:pPr>
-      <w:r>
-        <w:t>Be sure to use text blocks in the Excel file to annotate your work</w:t>
-      </w:r>
-    </w:p>
-    <w:p>
-      <w:pPr>
-        <w:pStyle w:val="NormalWeb"/>
-        <w:ind w:left="720"/>
-      </w:pPr>
-      <w:r>
-        <w:t xml:space="preserve">For </w:t>
-      </w:r>
-      <w:r>
-        <w:t>example,</w:t>
-      </w:r>
-      <w:r>
-        <w:t xml:space="preserve"> if you are using a formula, show the formula</w:t>
-      </w:r>
-    </w:p>
-    <w:p>
-      <w:pPr>
-        <w:pStyle w:val="NormalWeb"/>
-      </w:pPr>
-      <w:r>
-        <w:t>(b) Working Notes (PDF). </w:t>
-      </w:r>
-    </w:p>
-    <w:p>
-      <w:pPr>
-        <w:pStyle w:val="NormalWeb"/>
-        <w:ind w:left="720"/>
-      </w:pPr>
-      <w:r>
-        <w:t xml:space="preserve">Document </w:t>
-      </w:r>
-      <w:r>
-        <w:t xml:space="preserve">your </w:t>
-      </w:r>
-      <w:r>
-        <w:t>procedures in a Working Notes file, uploaded as a PDF.</w:t>
-      </w:r>
-    </w:p>
-    <w:p>
-      <w:pPr>
-        <w:pStyle w:val="NormalWeb"/>
-        <w:ind w:left="720"/>
-      </w:pPr>
-      <w:r>
-        <w:t>S</w:t>
-      </w:r>
-      <w:r>
-        <w:t xml:space="preserve">how photos </w:t>
-      </w:r>
-      <w:r>
-        <w:t xml:space="preserve">and/or sketches </w:t>
-      </w:r>
-      <w:r>
-        <w:t>of your work</w:t>
-      </w:r>
-    </w:p>
-    <w:p>
-      <w:pPr>
-        <w:pStyle w:val="NormalWeb"/>
-        <w:ind w:left="720"/>
-      </w:pPr>
-      <w:r>
-        <w:t>Provide written notes of how you did the work</w:t>
-      </w:r>
-    </w:p>
-    <w:p>
-      <w:pPr>
-        <w:pStyle w:val="NormalWeb"/>
-        <w:ind w:left="720"/>
-      </w:pPr>
-      <w:r>
-        <w:t>Include observations of your work</w:t>
-      </w:r>
-      <w:r>
-        <w:t xml:space="preserve"> </w:t>
-      </w:r>
-      <w:r>
-        <w:t xml:space="preserve">such as if you had difficulty with something, what did you do to resolve the issue, what kinds of troubleshooting did you undertake, </w:t>
-      </w:r>
-      <w:proofErr w:type="spellStart"/>
-      <w:r>
-        <w:t>etc</w:t>
-      </w:r>
-      <w:proofErr w:type="spellEnd"/>
-    </w:p>
-    <w:p>
-      <w:pPr>
-        <w:pStyle w:val="NormalWeb"/>
-        <w:ind w:left="720"/>
+    </w:p>
+    <w:p>
+      <w:pPr>
+        <w:pStyle w:val="NormalWeb"/>
+        <w:numPr>
+          <w:ilvl w:val="0"/>
+          <w:numId w:val="15"/>
+        </w:numPr>
       </w:pPr>
       <w:r>
         <w:t>Provide a</w:t>
@@ -794,7 +1266,10 @@
     <w:p>
       <w:pPr>
         <w:pStyle w:val="NormalWeb"/>
-        <w:ind w:left="720"/>
+        <w:numPr>
+          <w:ilvl w:val="0"/>
+          <w:numId w:val="15"/>
+        </w:numPr>
       </w:pPr>
       <w:r>
         <w:t xml:space="preserve">Provide </w:t>
@@ -809,7 +1284,7 @@
       </w:pPr>
     </w:p>
     <w:sectPr>
-      <w:headerReference w:type="default" r:id="rId10"/>
+      <w:headerReference w:type="default" r:id="rId12"/>
       <w:pgSz w:w="12240" w:h="15840"/>
       <w:pgMar w:top="1440" w:right="1440" w:bottom="1440" w:left="1440" w:header="720" w:footer="720" w:gutter="0"/>
       <w:cols w:space="720"/>
@@ -820,7 +1295,7 @@
 </file>
 
 <file path=word/endnotes.xml><?xml version="1.0" encoding="utf-8"?>
-<w:endnotes xmlns:wpc="http://schemas.microsoft.com/office/word/2010/wordprocessingCanvas" xmlns:cx="http://schemas.microsoft.com/office/drawing/2014/chartex" xmlns:cx1="http://schemas.microsoft.com/office/drawing/2015/9/8/chartex" xmlns:cx2="http://schemas.microsoft.com/office/drawing/2015/10/21/chartex" xmlns:cx3="http://schemas.microsoft.com/office/drawing/2016/5/9/chartex" xmlns:cx4="http://schemas.microsoft.com/office/drawing/2016/5/10/chartex" xmlns:cx5="http://schemas.microsoft.com/office/drawing/2016/5/11/chartex" xmlns:cx6="http://schemas.microsoft.com/office/drawing/2016/5/12/chartex" xmlns:cx7="http://schemas.microsoft.com/office/drawing/2016/5/13/chartex" xmlns:cx8="http://schemas.microsoft.com/office/drawing/2016/5/14/chartex" xmlns:mc="http://schemas.openxmlformats.org/markup-compatibility/2006" xmlns:aink="http://schemas.microsoft.com/office/drawing/2016/ink" xmlns:am3d="http://schemas.microsoft.com/office/drawing/2017/model3d" xmlns:o="urn:schemas-microsoft-com:office:office" xmlns:r="http://schemas.openxmlformats.org/officeDocument/2006/relationships" xmlns:m="http://schemas.openxmlformats.org/officeDocument/2006/math" xmlns:v="urn:schemas-microsoft-com:vml" xmlns:wp14="http://schemas.microsoft.com/office/word/2010/wordprocessingDrawing" xmlns:wp="http://schemas.openxmlformats.org/drawingml/2006/wordprocessingDrawing" xmlns:w10="urn:schemas-microsoft-com:office:word" xmlns:w="http://schemas.openxmlformats.org/wordprocessingml/2006/main" xmlns:w14="http://schemas.microsoft.com/office/word/2010/wordml" xmlns:w15="http://schemas.microsoft.com/office/word/2012/wordml" xmlns:w16cid="http://schemas.microsoft.com/office/word/2016/wordml/cid" xmlns:w16se="http://schemas.microsoft.com/office/word/2015/wordml/symex" xmlns:wpg="http://schemas.microsoft.com/office/word/2010/wordprocessingGroup" xmlns:wpi="http://schemas.microsoft.com/office/word/2010/wordprocessingInk" xmlns:wne="http://schemas.microsoft.com/office/word/2006/wordml" xmlns:wps="http://schemas.microsoft.com/office/word/2010/wordprocessingShape" mc:Ignorable="w14 w15 w16se w16cid wp14">
+<w:endnotes xmlns:wpc="http://schemas.microsoft.com/office/word/2010/wordprocessingCanvas" xmlns:cx="http://schemas.microsoft.com/office/drawing/2014/chartex" xmlns:cx1="http://schemas.microsoft.com/office/drawing/2015/9/8/chartex" xmlns:cx2="http://schemas.microsoft.com/office/drawing/2015/10/21/chartex" xmlns:cx3="http://schemas.microsoft.com/office/drawing/2016/5/9/chartex" xmlns:cx4="http://schemas.microsoft.com/office/drawing/2016/5/10/chartex" xmlns:cx5="http://schemas.microsoft.com/office/drawing/2016/5/11/chartex" xmlns:cx6="http://schemas.microsoft.com/office/drawing/2016/5/12/chartex" xmlns:cx7="http://schemas.microsoft.com/office/drawing/2016/5/13/chartex" xmlns:cx8="http://schemas.microsoft.com/office/drawing/2016/5/14/chartex" xmlns:mc="http://schemas.openxmlformats.org/markup-compatibility/2006" xmlns:aink="http://schemas.microsoft.com/office/drawing/2016/ink" xmlns:am3d="http://schemas.microsoft.com/office/drawing/2017/model3d" xmlns:o="urn:schemas-microsoft-com:office:office" xmlns:r="http://schemas.openxmlformats.org/officeDocument/2006/relationships" xmlns:m="http://schemas.openxmlformats.org/officeDocument/2006/math" xmlns:v="urn:schemas-microsoft-com:vml" xmlns:wp14="http://schemas.microsoft.com/office/word/2010/wordprocessingDrawing" xmlns:wp="http://schemas.openxmlformats.org/drawingml/2006/wordprocessingDrawing" xmlns:w10="urn:schemas-microsoft-com:office:word" xmlns:w="http://schemas.openxmlformats.org/wordprocessingml/2006/main" xmlns:w14="http://schemas.microsoft.com/office/word/2010/wordml" xmlns:w15="http://schemas.microsoft.com/office/word/2012/wordml" xmlns:w16cex="http://schemas.microsoft.com/office/word/2018/wordml/cex" xmlns:w16cid="http://schemas.microsoft.com/office/word/2016/wordml/cid" xmlns:w16="http://schemas.microsoft.com/office/word/2018/wordml" xmlns:w16sdtdh="http://schemas.microsoft.com/office/word/2020/wordml/sdtdatahash" xmlns:w16se="http://schemas.microsoft.com/office/word/2015/wordml/symex" xmlns:wpg="http://schemas.microsoft.com/office/word/2010/wordprocessingGroup" xmlns:wpi="http://schemas.microsoft.com/office/word/2010/wordprocessingInk" xmlns:wne="http://schemas.microsoft.com/office/word/2006/wordml" xmlns:wps="http://schemas.microsoft.com/office/word/2010/wordprocessingShape" mc:Ignorable="w14 w15 w16se w16cid w16 w16cex w16sdtdh wp14">
   <w:endnote w:type="separator" w:id="-1">
     <w:p>
       <w:pPr>
@@ -845,7 +1320,7 @@
 </file>
 
 <file path=word/footnotes.xml><?xml version="1.0" encoding="utf-8"?>
-<w:footnotes xmlns:wpc="http://schemas.microsoft.com/office/word/2010/wordprocessingCanvas" xmlns:cx="http://schemas.microsoft.com/office/drawing/2014/chartex" xmlns:cx1="http://schemas.microsoft.com/office/drawing/2015/9/8/chartex" xmlns:cx2="http://schemas.microsoft.com/office/drawing/2015/10/21/chartex" xmlns:cx3="http://schemas.microsoft.com/office/drawing/2016/5/9/chartex" xmlns:cx4="http://schemas.microsoft.com/office/drawing/2016/5/10/chartex" xmlns:cx5="http://schemas.microsoft.com/office/drawing/2016/5/11/chartex" xmlns:cx6="http://schemas.microsoft.com/office/drawing/2016/5/12/chartex" xmlns:cx7="http://schemas.microsoft.com/office/drawing/2016/5/13/chartex" xmlns:cx8="http://schemas.microsoft.com/office/drawing/2016/5/14/chartex" xmlns:mc="http://schemas.openxmlformats.org/markup-compatibility/2006" xmlns:aink="http://schemas.microsoft.com/office/drawing/2016/ink" xmlns:am3d="http://schemas.microsoft.com/office/drawing/2017/model3d" xmlns:o="urn:schemas-microsoft-com:office:office" xmlns:r="http://schemas.openxmlformats.org/officeDocument/2006/relationships" xmlns:m="http://schemas.openxmlformats.org/officeDocument/2006/math" xmlns:v="urn:schemas-microsoft-com:vml" xmlns:wp14="http://schemas.microsoft.com/office/word/2010/wordprocessingDrawing" xmlns:wp="http://schemas.openxmlformats.org/drawingml/2006/wordprocessingDrawing" xmlns:w10="urn:schemas-microsoft-com:office:word" xmlns:w="http://schemas.openxmlformats.org/wordprocessingml/2006/main" xmlns:w14="http://schemas.microsoft.com/office/word/2010/wordml" xmlns:w15="http://schemas.microsoft.com/office/word/2012/wordml" xmlns:w16cid="http://schemas.microsoft.com/office/word/2016/wordml/cid" xmlns:w16se="http://schemas.microsoft.com/office/word/2015/wordml/symex" xmlns:wpg="http://schemas.microsoft.com/office/word/2010/wordprocessingGroup" xmlns:wpi="http://schemas.microsoft.com/office/word/2010/wordprocessingInk" xmlns:wne="http://schemas.microsoft.com/office/word/2006/wordml" xmlns:wps="http://schemas.microsoft.com/office/word/2010/wordprocessingShape" mc:Ignorable="w14 w15 w16se w16cid wp14">
+<w:footnotes xmlns:wpc="http://schemas.microsoft.com/office/word/2010/wordprocessingCanvas" xmlns:cx="http://schemas.microsoft.com/office/drawing/2014/chartex" xmlns:cx1="http://schemas.microsoft.com/office/drawing/2015/9/8/chartex" xmlns:cx2="http://schemas.microsoft.com/office/drawing/2015/10/21/chartex" xmlns:cx3="http://schemas.microsoft.com/office/drawing/2016/5/9/chartex" xmlns:cx4="http://schemas.microsoft.com/office/drawing/2016/5/10/chartex" xmlns:cx5="http://schemas.microsoft.com/office/drawing/2016/5/11/chartex" xmlns:cx6="http://schemas.microsoft.com/office/drawing/2016/5/12/chartex" xmlns:cx7="http://schemas.microsoft.com/office/drawing/2016/5/13/chartex" xmlns:cx8="http://schemas.microsoft.com/office/drawing/2016/5/14/chartex" xmlns:mc="http://schemas.openxmlformats.org/markup-compatibility/2006" xmlns:aink="http://schemas.microsoft.com/office/drawing/2016/ink" xmlns:am3d="http://schemas.microsoft.com/office/drawing/2017/model3d" xmlns:o="urn:schemas-microsoft-com:office:office" xmlns:r="http://schemas.openxmlformats.org/officeDocument/2006/relationships" xmlns:m="http://schemas.openxmlformats.org/officeDocument/2006/math" xmlns:v="urn:schemas-microsoft-com:vml" xmlns:wp14="http://schemas.microsoft.com/office/word/2010/wordprocessingDrawing" xmlns:wp="http://schemas.openxmlformats.org/drawingml/2006/wordprocessingDrawing" xmlns:w10="urn:schemas-microsoft-com:office:word" xmlns:w="http://schemas.openxmlformats.org/wordprocessingml/2006/main" xmlns:w14="http://schemas.microsoft.com/office/word/2010/wordml" xmlns:w15="http://schemas.microsoft.com/office/word/2012/wordml" xmlns:w16cex="http://schemas.microsoft.com/office/word/2018/wordml/cex" xmlns:w16cid="http://schemas.microsoft.com/office/word/2016/wordml/cid" xmlns:w16="http://schemas.microsoft.com/office/word/2018/wordml" xmlns:w16sdtdh="http://schemas.microsoft.com/office/word/2020/wordml/sdtdatahash" xmlns:w16se="http://schemas.microsoft.com/office/word/2015/wordml/symex" xmlns:wpg="http://schemas.microsoft.com/office/word/2010/wordprocessingGroup" xmlns:wpi="http://schemas.microsoft.com/office/word/2010/wordprocessingInk" xmlns:wne="http://schemas.microsoft.com/office/word/2006/wordml" xmlns:wps="http://schemas.microsoft.com/office/word/2010/wordprocessingShape" mc:Ignorable="w14 w15 w16se w16cid w16 w16cex w16sdtdh wp14">
   <w:footnote w:type="separator" w:id="-1">
     <w:p>
       <w:pPr>
@@ -870,39 +1345,19 @@
 </file>
 
 <file path=word/header1.xml><?xml version="1.0" encoding="utf-8"?>
-<w:hdr xmlns:wpc="http://schemas.microsoft.com/office/word/2010/wordprocessingCanvas" xmlns:cx="http://schemas.microsoft.com/office/drawing/2014/chartex" xmlns:cx1="http://schemas.microsoft.com/office/drawing/2015/9/8/chartex" xmlns:cx2="http://schemas.microsoft.com/office/drawing/2015/10/21/chartex" xmlns:cx3="http://schemas.microsoft.com/office/drawing/2016/5/9/chartex" xmlns:cx4="http://schemas.microsoft.com/office/drawing/2016/5/10/chartex" xmlns:cx5="http://schemas.microsoft.com/office/drawing/2016/5/11/chartex" xmlns:cx6="http://schemas.microsoft.com/office/drawing/2016/5/12/chartex" xmlns:cx7="http://schemas.microsoft.com/office/drawing/2016/5/13/chartex" xmlns:cx8="http://schemas.microsoft.com/office/drawing/2016/5/14/chartex" xmlns:mc="http://schemas.openxmlformats.org/markup-compatibility/2006" xmlns:aink="http://schemas.microsoft.com/office/drawing/2016/ink" xmlns:am3d="http://schemas.microsoft.com/office/drawing/2017/model3d" xmlns:o="urn:schemas-microsoft-com:office:office" xmlns:r="http://schemas.openxmlformats.org/officeDocument/2006/relationships" xmlns:m="http://schemas.openxmlformats.org/officeDocument/2006/math" xmlns:v="urn:schemas-microsoft-com:vml" xmlns:wp14="http://schemas.microsoft.com/office/word/2010/wordprocessingDrawing" xmlns:wp="http://schemas.openxmlformats.org/drawingml/2006/wordprocessingDrawing" xmlns:w10="urn:schemas-microsoft-com:office:word" xmlns:w="http://schemas.openxmlformats.org/wordprocessingml/2006/main" xmlns:w14="http://schemas.microsoft.com/office/word/2010/wordml" xmlns:w15="http://schemas.microsoft.com/office/word/2012/wordml" xmlns:w16cid="http://schemas.microsoft.com/office/word/2016/wordml/cid" xmlns:w16se="http://schemas.microsoft.com/office/word/2015/wordml/symex" xmlns:wpg="http://schemas.microsoft.com/office/word/2010/wordprocessingGroup" xmlns:wpi="http://schemas.microsoft.com/office/word/2010/wordprocessingInk" xmlns:wne="http://schemas.microsoft.com/office/word/2006/wordml" xmlns:wps="http://schemas.microsoft.com/office/word/2010/wordprocessingShape" mc:Ignorable="w14 w15 w16se w16cid wp14">
+<w:hdr xmlns:wpc="http://schemas.microsoft.com/office/word/2010/wordprocessingCanvas" xmlns:cx="http://schemas.microsoft.com/office/drawing/2014/chartex" xmlns:cx1="http://schemas.microsoft.com/office/drawing/2015/9/8/chartex" xmlns:cx2="http://schemas.microsoft.com/office/drawing/2015/10/21/chartex" xmlns:cx3="http://schemas.microsoft.com/office/drawing/2016/5/9/chartex" xmlns:cx4="http://schemas.microsoft.com/office/drawing/2016/5/10/chartex" xmlns:cx5="http://schemas.microsoft.com/office/drawing/2016/5/11/chartex" xmlns:cx6="http://schemas.microsoft.com/office/drawing/2016/5/12/chartex" xmlns:cx7="http://schemas.microsoft.com/office/drawing/2016/5/13/chartex" xmlns:cx8="http://schemas.microsoft.com/office/drawing/2016/5/14/chartex" xmlns:mc="http://schemas.openxmlformats.org/markup-compatibility/2006" xmlns:aink="http://schemas.microsoft.com/office/drawing/2016/ink" xmlns:am3d="http://schemas.microsoft.com/office/drawing/2017/model3d" xmlns:o="urn:schemas-microsoft-com:office:office" xmlns:r="http://schemas.openxmlformats.org/officeDocument/2006/relationships" xmlns:m="http://schemas.openxmlformats.org/officeDocument/2006/math" xmlns:v="urn:schemas-microsoft-com:vml" xmlns:wp14="http://schemas.microsoft.com/office/word/2010/wordprocessingDrawing" xmlns:wp="http://schemas.openxmlformats.org/drawingml/2006/wordprocessingDrawing" xmlns:w10="urn:schemas-microsoft-com:office:word" xmlns:w="http://schemas.openxmlformats.org/wordprocessingml/2006/main" xmlns:w14="http://schemas.microsoft.com/office/word/2010/wordml" xmlns:w15="http://schemas.microsoft.com/office/word/2012/wordml" xmlns:w16cex="http://schemas.microsoft.com/office/word/2018/wordml/cex" xmlns:w16cid="http://schemas.microsoft.com/office/word/2016/wordml/cid" xmlns:w16="http://schemas.microsoft.com/office/word/2018/wordml" xmlns:w16sdtdh="http://schemas.microsoft.com/office/word/2020/wordml/sdtdatahash" xmlns:w16se="http://schemas.microsoft.com/office/word/2015/wordml/symex" xmlns:wpg="http://schemas.microsoft.com/office/word/2010/wordprocessingGroup" xmlns:wpi="http://schemas.microsoft.com/office/word/2010/wordprocessingInk" xmlns:wne="http://schemas.microsoft.com/office/word/2006/wordml" xmlns:wps="http://schemas.microsoft.com/office/word/2010/wordprocessingShape" mc:Ignorable="w14 w15 w16se w16cid w16 w16cex w16sdtdh wp14">
   <w:p>
     <w:pPr>
       <w:pStyle w:val="NormalWeb"/>
     </w:pPr>
     <w:r>
-      <w:t xml:space="preserve">ME </w:t>
-    </w:r>
-    <w:proofErr w:type="gramStart"/>
-    <w:r>
-      <w:t>3023</w:t>
+      <w:t>ME 3023               Challenge 1 </w:t>
     </w:r>
     <w:r>
-      <w:tab/>
-    </w:r>
-    <w:r>
-      <w:tab/>
-    </w:r>
-    <w:r>
-      <w:tab/>
-    </w:r>
-    <w:r>
-      <w:t>Dimensional</w:t>
-    </w:r>
-    <w:proofErr w:type="gramEnd"/>
-    <w:r>
-      <w:t xml:space="preserve"> </w:t>
+      <w:t xml:space="preserve">Dimensional </w:t>
     </w:r>
     <w:r>
       <w:t>Instruments</w:t>
-    </w:r>
-    <w:r>
-      <w:t xml:space="preserve"> Challenge</w:t>
     </w:r>
   </w:p>
   <w:p>
@@ -914,7 +1369,7 @@
 </file>
 
 <file path=word/numbering.xml><?xml version="1.0" encoding="utf-8"?>
-<w:numbering xmlns:wpc="http://schemas.microsoft.com/office/word/2010/wordprocessingCanvas" xmlns:cx="http://schemas.microsoft.com/office/drawing/2014/chartex" xmlns:cx1="http://schemas.microsoft.com/office/drawing/2015/9/8/chartex" xmlns:cx2="http://schemas.microsoft.com/office/drawing/2015/10/21/chartex" xmlns:cx3="http://schemas.microsoft.com/office/drawing/2016/5/9/chartex" xmlns:cx4="http://schemas.microsoft.com/office/drawing/2016/5/10/chartex" xmlns:cx5="http://schemas.microsoft.com/office/drawing/2016/5/11/chartex" xmlns:cx6="http://schemas.microsoft.com/office/drawing/2016/5/12/chartex" xmlns:cx7="http://schemas.microsoft.com/office/drawing/2016/5/13/chartex" xmlns:cx8="http://schemas.microsoft.com/office/drawing/2016/5/14/chartex" xmlns:mc="http://schemas.openxmlformats.org/markup-compatibility/2006" xmlns:aink="http://schemas.microsoft.com/office/drawing/2016/ink" xmlns:am3d="http://schemas.microsoft.com/office/drawing/2017/model3d" xmlns:o="urn:schemas-microsoft-com:office:office" xmlns:r="http://schemas.openxmlformats.org/officeDocument/2006/relationships" xmlns:m="http://schemas.openxmlformats.org/officeDocument/2006/math" xmlns:v="urn:schemas-microsoft-com:vml" xmlns:wp14="http://schemas.microsoft.com/office/word/2010/wordprocessingDrawing" xmlns:wp="http://schemas.openxmlformats.org/drawingml/2006/wordprocessingDrawing" xmlns:w10="urn:schemas-microsoft-com:office:word" xmlns:w="http://schemas.openxmlformats.org/wordprocessingml/2006/main" xmlns:w14="http://schemas.microsoft.com/office/word/2010/wordml" xmlns:w15="http://schemas.microsoft.com/office/word/2012/wordml" xmlns:w16cid="http://schemas.microsoft.com/office/word/2016/wordml/cid" xmlns:w16se="http://schemas.microsoft.com/office/word/2015/wordml/symex" xmlns:wpg="http://schemas.microsoft.com/office/word/2010/wordprocessingGroup" xmlns:wpi="http://schemas.microsoft.com/office/word/2010/wordprocessingInk" xmlns:wne="http://schemas.microsoft.com/office/word/2006/wordml" xmlns:wps="http://schemas.microsoft.com/office/word/2010/wordprocessingShape" mc:Ignorable="w14 w15 w16se w16cid wp14">
+<w:numbering xmlns:wpc="http://schemas.microsoft.com/office/word/2010/wordprocessingCanvas" xmlns:cx="http://schemas.microsoft.com/office/drawing/2014/chartex" xmlns:cx1="http://schemas.microsoft.com/office/drawing/2015/9/8/chartex" xmlns:cx2="http://schemas.microsoft.com/office/drawing/2015/10/21/chartex" xmlns:cx3="http://schemas.microsoft.com/office/drawing/2016/5/9/chartex" xmlns:cx4="http://schemas.microsoft.com/office/drawing/2016/5/10/chartex" xmlns:cx5="http://schemas.microsoft.com/office/drawing/2016/5/11/chartex" xmlns:cx6="http://schemas.microsoft.com/office/drawing/2016/5/12/chartex" xmlns:cx7="http://schemas.microsoft.com/office/drawing/2016/5/13/chartex" xmlns:cx8="http://schemas.microsoft.com/office/drawing/2016/5/14/chartex" xmlns:mc="http://schemas.openxmlformats.org/markup-compatibility/2006" xmlns:aink="http://schemas.microsoft.com/office/drawing/2016/ink" xmlns:am3d="http://schemas.microsoft.com/office/drawing/2017/model3d" xmlns:o="urn:schemas-microsoft-com:office:office" xmlns:r="http://schemas.openxmlformats.org/officeDocument/2006/relationships" xmlns:m="http://schemas.openxmlformats.org/officeDocument/2006/math" xmlns:v="urn:schemas-microsoft-com:vml" xmlns:wp14="http://schemas.microsoft.com/office/word/2010/wordprocessingDrawing" xmlns:wp="http://schemas.openxmlformats.org/drawingml/2006/wordprocessingDrawing" xmlns:w10="urn:schemas-microsoft-com:office:word" xmlns:w="http://schemas.openxmlformats.org/wordprocessingml/2006/main" xmlns:w14="http://schemas.microsoft.com/office/word/2010/wordml" xmlns:w15="http://schemas.microsoft.com/office/word/2012/wordml" xmlns:w16cex="http://schemas.microsoft.com/office/word/2018/wordml/cex" xmlns:w16cid="http://schemas.microsoft.com/office/word/2016/wordml/cid" xmlns:w16="http://schemas.microsoft.com/office/word/2018/wordml" xmlns:w16sdtdh="http://schemas.microsoft.com/office/word/2020/wordml/sdtdatahash" xmlns:w16se="http://schemas.microsoft.com/office/word/2015/wordml/symex" xmlns:wpg="http://schemas.microsoft.com/office/word/2010/wordprocessingGroup" xmlns:wpi="http://schemas.microsoft.com/office/word/2010/wordprocessingInk" xmlns:wne="http://schemas.microsoft.com/office/word/2006/wordml" xmlns:wps="http://schemas.microsoft.com/office/word/2010/wordprocessingShape" mc:Ignorable="w14 w15 w16se w16cid w16 w16cex w16sdtdh wp14">
   <w:abstractNum w:abstractNumId="0" w15:restartNumberingAfterBreak="0">
     <w:nsid w:val="00AD28C9"/>
     <w:multiLevelType w:val="hybridMultilevel"/>
@@ -2176,6 +2631,232 @@
     </w:lvl>
   </w:abstractNum>
   <w:abstractNum w:abstractNumId="12" w15:restartNumberingAfterBreak="0">
+    <w:nsid w:val="6AA50796"/>
+    <w:multiLevelType w:val="hybridMultilevel"/>
+    <w:tmpl w:val="76F63610"/>
+    <w:lvl w:ilvl="0" w:tplc="04090001">
+      <w:start w:val="1"/>
+      <w:numFmt w:val="bullet"/>
+      <w:lvlText w:val=""/>
+      <w:lvlJc w:val="left"/>
+      <w:pPr>
+        <w:ind w:left="1440" w:hanging="360"/>
+      </w:pPr>
+      <w:rPr>
+        <w:rFonts w:ascii="Symbol" w:hAnsi="Symbol" w:hint="default"/>
+      </w:rPr>
+    </w:lvl>
+    <w:lvl w:ilvl="1" w:tplc="04090003" w:tentative="1">
+      <w:start w:val="1"/>
+      <w:numFmt w:val="bullet"/>
+      <w:lvlText w:val="o"/>
+      <w:lvlJc w:val="left"/>
+      <w:pPr>
+        <w:ind w:left="2160" w:hanging="360"/>
+      </w:pPr>
+      <w:rPr>
+        <w:rFonts w:ascii="Courier New" w:hAnsi="Courier New" w:cs="Courier New" w:hint="default"/>
+      </w:rPr>
+    </w:lvl>
+    <w:lvl w:ilvl="2" w:tplc="04090005" w:tentative="1">
+      <w:start w:val="1"/>
+      <w:numFmt w:val="bullet"/>
+      <w:lvlText w:val=""/>
+      <w:lvlJc w:val="left"/>
+      <w:pPr>
+        <w:ind w:left="2880" w:hanging="360"/>
+      </w:pPr>
+      <w:rPr>
+        <w:rFonts w:ascii="Wingdings" w:hAnsi="Wingdings" w:hint="default"/>
+      </w:rPr>
+    </w:lvl>
+    <w:lvl w:ilvl="3" w:tplc="04090001" w:tentative="1">
+      <w:start w:val="1"/>
+      <w:numFmt w:val="bullet"/>
+      <w:lvlText w:val=""/>
+      <w:lvlJc w:val="left"/>
+      <w:pPr>
+        <w:ind w:left="3600" w:hanging="360"/>
+      </w:pPr>
+      <w:rPr>
+        <w:rFonts w:ascii="Symbol" w:hAnsi="Symbol" w:hint="default"/>
+      </w:rPr>
+    </w:lvl>
+    <w:lvl w:ilvl="4" w:tplc="04090003" w:tentative="1">
+      <w:start w:val="1"/>
+      <w:numFmt w:val="bullet"/>
+      <w:lvlText w:val="o"/>
+      <w:lvlJc w:val="left"/>
+      <w:pPr>
+        <w:ind w:left="4320" w:hanging="360"/>
+      </w:pPr>
+      <w:rPr>
+        <w:rFonts w:ascii="Courier New" w:hAnsi="Courier New" w:cs="Courier New" w:hint="default"/>
+      </w:rPr>
+    </w:lvl>
+    <w:lvl w:ilvl="5" w:tplc="04090005" w:tentative="1">
+      <w:start w:val="1"/>
+      <w:numFmt w:val="bullet"/>
+      <w:lvlText w:val=""/>
+      <w:lvlJc w:val="left"/>
+      <w:pPr>
+        <w:ind w:left="5040" w:hanging="360"/>
+      </w:pPr>
+      <w:rPr>
+        <w:rFonts w:ascii="Wingdings" w:hAnsi="Wingdings" w:hint="default"/>
+      </w:rPr>
+    </w:lvl>
+    <w:lvl w:ilvl="6" w:tplc="04090001" w:tentative="1">
+      <w:start w:val="1"/>
+      <w:numFmt w:val="bullet"/>
+      <w:lvlText w:val=""/>
+      <w:lvlJc w:val="left"/>
+      <w:pPr>
+        <w:ind w:left="5760" w:hanging="360"/>
+      </w:pPr>
+      <w:rPr>
+        <w:rFonts w:ascii="Symbol" w:hAnsi="Symbol" w:hint="default"/>
+      </w:rPr>
+    </w:lvl>
+    <w:lvl w:ilvl="7" w:tplc="04090003" w:tentative="1">
+      <w:start w:val="1"/>
+      <w:numFmt w:val="bullet"/>
+      <w:lvlText w:val="o"/>
+      <w:lvlJc w:val="left"/>
+      <w:pPr>
+        <w:ind w:left="6480" w:hanging="360"/>
+      </w:pPr>
+      <w:rPr>
+        <w:rFonts w:ascii="Courier New" w:hAnsi="Courier New" w:cs="Courier New" w:hint="default"/>
+      </w:rPr>
+    </w:lvl>
+    <w:lvl w:ilvl="8" w:tplc="04090005" w:tentative="1">
+      <w:start w:val="1"/>
+      <w:numFmt w:val="bullet"/>
+      <w:lvlText w:val=""/>
+      <w:lvlJc w:val="left"/>
+      <w:pPr>
+        <w:ind w:left="7200" w:hanging="360"/>
+      </w:pPr>
+      <w:rPr>
+        <w:rFonts w:ascii="Wingdings" w:hAnsi="Wingdings" w:hint="default"/>
+      </w:rPr>
+    </w:lvl>
+  </w:abstractNum>
+  <w:abstractNum w:abstractNumId="13" w15:restartNumberingAfterBreak="0">
+    <w:nsid w:val="71080445"/>
+    <w:multiLevelType w:val="hybridMultilevel"/>
+    <w:tmpl w:val="E6480352"/>
+    <w:lvl w:ilvl="0" w:tplc="04090001">
+      <w:start w:val="1"/>
+      <w:numFmt w:val="bullet"/>
+      <w:lvlText w:val=""/>
+      <w:lvlJc w:val="left"/>
+      <w:pPr>
+        <w:ind w:left="1440" w:hanging="360"/>
+      </w:pPr>
+      <w:rPr>
+        <w:rFonts w:ascii="Symbol" w:hAnsi="Symbol" w:hint="default"/>
+      </w:rPr>
+    </w:lvl>
+    <w:lvl w:ilvl="1" w:tplc="04090003" w:tentative="1">
+      <w:start w:val="1"/>
+      <w:numFmt w:val="bullet"/>
+      <w:lvlText w:val="o"/>
+      <w:lvlJc w:val="left"/>
+      <w:pPr>
+        <w:ind w:left="2160" w:hanging="360"/>
+      </w:pPr>
+      <w:rPr>
+        <w:rFonts w:ascii="Courier New" w:hAnsi="Courier New" w:cs="Courier New" w:hint="default"/>
+      </w:rPr>
+    </w:lvl>
+    <w:lvl w:ilvl="2" w:tplc="04090005" w:tentative="1">
+      <w:start w:val="1"/>
+      <w:numFmt w:val="bullet"/>
+      <w:lvlText w:val=""/>
+      <w:lvlJc w:val="left"/>
+      <w:pPr>
+        <w:ind w:left="2880" w:hanging="360"/>
+      </w:pPr>
+      <w:rPr>
+        <w:rFonts w:ascii="Wingdings" w:hAnsi="Wingdings" w:hint="default"/>
+      </w:rPr>
+    </w:lvl>
+    <w:lvl w:ilvl="3" w:tplc="04090001" w:tentative="1">
+      <w:start w:val="1"/>
+      <w:numFmt w:val="bullet"/>
+      <w:lvlText w:val=""/>
+      <w:lvlJc w:val="left"/>
+      <w:pPr>
+        <w:ind w:left="3600" w:hanging="360"/>
+      </w:pPr>
+      <w:rPr>
+        <w:rFonts w:ascii="Symbol" w:hAnsi="Symbol" w:hint="default"/>
+      </w:rPr>
+    </w:lvl>
+    <w:lvl w:ilvl="4" w:tplc="04090003" w:tentative="1">
+      <w:start w:val="1"/>
+      <w:numFmt w:val="bullet"/>
+      <w:lvlText w:val="o"/>
+      <w:lvlJc w:val="left"/>
+      <w:pPr>
+        <w:ind w:left="4320" w:hanging="360"/>
+      </w:pPr>
+      <w:rPr>
+        <w:rFonts w:ascii="Courier New" w:hAnsi="Courier New" w:cs="Courier New" w:hint="default"/>
+      </w:rPr>
+    </w:lvl>
+    <w:lvl w:ilvl="5" w:tplc="04090005" w:tentative="1">
+      <w:start w:val="1"/>
+      <w:numFmt w:val="bullet"/>
+      <w:lvlText w:val=""/>
+      <w:lvlJc w:val="left"/>
+      <w:pPr>
+        <w:ind w:left="5040" w:hanging="360"/>
+      </w:pPr>
+      <w:rPr>
+        <w:rFonts w:ascii="Wingdings" w:hAnsi="Wingdings" w:hint="default"/>
+      </w:rPr>
+    </w:lvl>
+    <w:lvl w:ilvl="6" w:tplc="04090001" w:tentative="1">
+      <w:start w:val="1"/>
+      <w:numFmt w:val="bullet"/>
+      <w:lvlText w:val=""/>
+      <w:lvlJc w:val="left"/>
+      <w:pPr>
+        <w:ind w:left="5760" w:hanging="360"/>
+      </w:pPr>
+      <w:rPr>
+        <w:rFonts w:ascii="Symbol" w:hAnsi="Symbol" w:hint="default"/>
+      </w:rPr>
+    </w:lvl>
+    <w:lvl w:ilvl="7" w:tplc="04090003" w:tentative="1">
+      <w:start w:val="1"/>
+      <w:numFmt w:val="bullet"/>
+      <w:lvlText w:val="o"/>
+      <w:lvlJc w:val="left"/>
+      <w:pPr>
+        <w:ind w:left="6480" w:hanging="360"/>
+      </w:pPr>
+      <w:rPr>
+        <w:rFonts w:ascii="Courier New" w:hAnsi="Courier New" w:cs="Courier New" w:hint="default"/>
+      </w:rPr>
+    </w:lvl>
+    <w:lvl w:ilvl="8" w:tplc="04090005" w:tentative="1">
+      <w:start w:val="1"/>
+      <w:numFmt w:val="bullet"/>
+      <w:lvlText w:val=""/>
+      <w:lvlJc w:val="left"/>
+      <w:pPr>
+        <w:ind w:left="7200" w:hanging="360"/>
+      </w:pPr>
+      <w:rPr>
+        <w:rFonts w:ascii="Wingdings" w:hAnsi="Wingdings" w:hint="default"/>
+      </w:rPr>
+    </w:lvl>
+  </w:abstractNum>
+  <w:abstractNum w:abstractNumId="14" w15:restartNumberingAfterBreak="0">
     <w:nsid w:val="7AE451B3"/>
     <w:multiLevelType w:val="multilevel"/>
     <w:tmpl w:val="FCB68272"/>
@@ -2295,7 +2976,7 @@
     <w:abstractNumId w:val="1"/>
   </w:num>
   <w:num w:numId="3">
-    <w:abstractNumId w:val="12"/>
+    <w:abstractNumId w:val="14"/>
   </w:num>
   <w:num w:numId="4">
     <w:abstractNumId w:val="10"/>
@@ -2327,11 +3008,17 @@
   <w:num w:numId="13">
     <w:abstractNumId w:val="0"/>
   </w:num>
+  <w:num w:numId="14">
+    <w:abstractNumId w:val="12"/>
+  </w:num>
+  <w:num w:numId="15">
+    <w:abstractNumId w:val="13"/>
+  </w:num>
 </w:numbering>
 </file>
 
 <file path=word/styles.xml><?xml version="1.0" encoding="utf-8"?>
-<w:styles xmlns:mc="http://schemas.openxmlformats.org/markup-compatibility/2006" xmlns:r="http://schemas.openxmlformats.org/officeDocument/2006/relationships" xmlns:w="http://schemas.openxmlformats.org/wordprocessingml/2006/main" xmlns:w14="http://schemas.microsoft.com/office/word/2010/wordml" xmlns:w15="http://schemas.microsoft.com/office/word/2012/wordml" xmlns:w16cid="http://schemas.microsoft.com/office/word/2016/wordml/cid" xmlns:w16se="http://schemas.microsoft.com/office/word/2015/wordml/symex" mc:Ignorable="w14 w15 w16se w16cid">
+<w:styles xmlns:mc="http://schemas.openxmlformats.org/markup-compatibility/2006" xmlns:r="http://schemas.openxmlformats.org/officeDocument/2006/relationships" xmlns:w="http://schemas.openxmlformats.org/wordprocessingml/2006/main" xmlns:w14="http://schemas.microsoft.com/office/word/2010/wordml" xmlns:w15="http://schemas.microsoft.com/office/word/2012/wordml" xmlns:w16cex="http://schemas.microsoft.com/office/word/2018/wordml/cex" xmlns:w16cid="http://schemas.microsoft.com/office/word/2016/wordml/cid" xmlns:w16="http://schemas.microsoft.com/office/word/2018/wordml" xmlns:w16sdtdh="http://schemas.microsoft.com/office/word/2020/wordml/sdtdatahash" xmlns:w16se="http://schemas.microsoft.com/office/word/2015/wordml/symex" mc:Ignorable="w14 w15 w16se w16cid w16 w16cex w16sdtdh">
   <w:docDefaults>
     <w:rPrDefault>
       <w:rPr>
@@ -2347,7 +3034,7 @@
       </w:pPr>
     </w:pPrDefault>
   </w:docDefaults>
-  <w:latentStyles w:defLockedState="0" w:defUIPriority="99" w:defSemiHidden="0" w:defUnhideWhenUsed="0" w:defQFormat="0" w:count="375">
+  <w:latentStyles w:defLockedState="0" w:defUIPriority="99" w:defSemiHidden="0" w:defUnhideWhenUsed="0" w:defQFormat="0" w:count="376">
     <w:lsdException w:name="Normal" w:uiPriority="0" w:qFormat="1"/>
     <w:lsdException w:name="heading 1" w:uiPriority="9" w:qFormat="1"/>
     <w:lsdException w:name="heading 2" w:semiHidden="1" w:uiPriority="9" w:unhideWhenUsed="1" w:qFormat="1"/>
@@ -2453,7 +3140,6 @@
     <w:lsdException w:name="HTML Sample" w:semiHidden="1" w:unhideWhenUsed="1"/>
     <w:lsdException w:name="HTML Typewriter" w:semiHidden="1" w:unhideWhenUsed="1"/>
     <w:lsdException w:name="HTML Variable" w:semiHidden="1" w:unhideWhenUsed="1"/>
-    <w:lsdException w:name="Normal Table" w:semiHidden="1" w:unhideWhenUsed="1"/>
     <w:lsdException w:name="annotation subject" w:semiHidden="1" w:unhideWhenUsed="1"/>
     <w:lsdException w:name="No List" w:semiHidden="1" w:unhideWhenUsed="1"/>
     <w:lsdException w:name="Outline List 1" w:semiHidden="1" w:unhideWhenUsed="1"/>
@@ -2500,10 +3186,8 @@
     <w:lsdException w:name="Table Subtle 2" w:semiHidden="1" w:unhideWhenUsed="1"/>
     <w:lsdException w:name="Table Web 1" w:semiHidden="1" w:unhideWhenUsed="1"/>
     <w:lsdException w:name="Table Web 2" w:semiHidden="1" w:unhideWhenUsed="1"/>
-    <w:lsdException w:name="Table Web 3" w:semiHidden="1" w:unhideWhenUsed="1"/>
     <w:lsdException w:name="Balloon Text" w:semiHidden="1" w:unhideWhenUsed="1"/>
     <w:lsdException w:name="Table Grid" w:uiPriority="39"/>
-    <w:lsdException w:name="Table Theme" w:semiHidden="1" w:unhideWhenUsed="1"/>
     <w:lsdException w:name="Placeholder Text" w:semiHidden="1"/>
     <w:lsdException w:name="No Spacing" w:uiPriority="1" w:qFormat="1"/>
     <w:lsdException w:name="Light Shading" w:uiPriority="60"/>
@@ -2723,6 +3407,7 @@
     <w:lsdException w:name="Smart Hyperlink" w:semiHidden="1" w:unhideWhenUsed="1"/>
     <w:lsdException w:name="Hashtag" w:semiHidden="1" w:unhideWhenUsed="1"/>
     <w:lsdException w:name="Unresolved Mention" w:semiHidden="1" w:unhideWhenUsed="1"/>
+    <w:lsdException w:name="Smart Link" w:semiHidden="1" w:unhideWhenUsed="1"/>
   </w:latentStyles>
   <w:style w:type="paragraph" w:default="1" w:styleId="Normal">
     <w:name w:val="Normal"/>
@@ -3109,21 +3794,12 @@
 </file>
 
 <file path=customXml/item1.xml><?xml version="1.0" encoding="utf-8"?>
-<?mso-contentType ?>
-<FormTemplates xmlns="http://schemas.microsoft.com/sharepoint/v3/contenttype/forms">
-  <Display>DocumentLibraryForm</Display>
-  <Edit>DocumentLibraryForm</Edit>
-  <New>DocumentLibraryForm</New>
-</FormTemplates>
-</file>
-
-<file path=customXml/item2.xml><?xml version="1.0" encoding="utf-8"?>
 <p:properties xmlns:p="http://schemas.microsoft.com/office/2006/metadata/properties" xmlns:xsi="http://www.w3.org/2001/XMLSchema-instance" xmlns:pc="http://schemas.microsoft.com/office/infopath/2007/PartnerControls">
   <documentManagement/>
 </p:properties>
 </file>
 
-<file path=customXml/item3.xml><?xml version="1.0" encoding="utf-8"?>
+<file path=customXml/item2.xml><?xml version="1.0" encoding="utf-8"?>
 <ct:contentTypeSchema xmlns:ct="http://schemas.microsoft.com/office/2006/metadata/contentType" xmlns:ma="http://schemas.microsoft.com/office/2006/metadata/properties/metaAttributes" ct:_="" ma:_="" ma:contentTypeName="Document" ma:contentTypeID="0x0101002950C178BAEFDE4EBF4BCA13945EF3F2" ma:contentTypeVersion="10" ma:contentTypeDescription="Create a new document." ma:contentTypeScope="" ma:versionID="36a093b4b470378e5ca4eb1b021a73de">
   <xsd:schema xmlns:xsd="http://www.w3.org/2001/XMLSchema" xmlns:xs="http://www.w3.org/2001/XMLSchema" xmlns:p="http://schemas.microsoft.com/office/2006/metadata/properties" xmlns:ns2="fb41178e-6c7a-4d3a-b514-1dd3bc275ba0" targetNamespace="http://schemas.microsoft.com/office/2006/metadata/properties" ma:root="true" ma:fieldsID="2da9ca20113c39a29fd807288175afe6" ns2:_="">
     <xsd:import namespace="fb41178e-6c7a-4d3a-b514-1dd3bc275ba0"/>
@@ -3307,15 +3983,16 @@
 </ct:contentTypeSchema>
 </file>
 
-<file path=customXml/itemProps1.xml><?xml version="1.0" encoding="utf-8"?>
-<ds:datastoreItem xmlns:ds="http://schemas.openxmlformats.org/officeDocument/2006/customXml" ds:itemID="{D34E9049-C4C4-4525-A905-9C0938917599}">
-  <ds:schemaRefs>
-    <ds:schemaRef ds:uri="http://schemas.microsoft.com/sharepoint/v3/contenttype/forms"/>
-  </ds:schemaRefs>
-</ds:datastoreItem>
+<file path=customXml/item3.xml><?xml version="1.0" encoding="utf-8"?>
+<?mso-contentType ?>
+<FormTemplates xmlns="http://schemas.microsoft.com/sharepoint/v3/contenttype/forms">
+  <Display>DocumentLibraryForm</Display>
+  <Edit>DocumentLibraryForm</Edit>
+  <New>DocumentLibraryForm</New>
+</FormTemplates>
 </file>
 
-<file path=customXml/itemProps2.xml><?xml version="1.0" encoding="utf-8"?>
+<file path=customXml/itemProps1.xml><?xml version="1.0" encoding="utf-8"?>
 <ds:datastoreItem xmlns:ds="http://schemas.openxmlformats.org/officeDocument/2006/customXml" ds:itemID="{97BDB02D-B983-4CDB-B345-CBE13EB8D698}">
   <ds:schemaRefs>
     <ds:schemaRef ds:uri="http://schemas.microsoft.com/office/2006/metadata/properties"/>
@@ -3324,7 +4001,7 @@
 </ds:datastoreItem>
 </file>
 
-<file path=customXml/itemProps3.xml><?xml version="1.0" encoding="utf-8"?>
+<file path=customXml/itemProps2.xml><?xml version="1.0" encoding="utf-8"?>
 <ds:datastoreItem xmlns:ds="http://schemas.openxmlformats.org/officeDocument/2006/customXml" ds:itemID="{6BBD22C4-302A-4E7B-BAAB-0BFBA45093B4}">
   <ds:schemaRefs>
     <ds:schemaRef ds:uri="http://schemas.microsoft.com/office/2006/metadata/contentType"/>
@@ -3340,4 +4017,12 @@
     <ds:schemaRef ds:uri="http://schemas.microsoft.com/internal/obd"/>
   </ds:schemaRefs>
 </ds:datastoreItem>
+</file>
+
+<file path=customXml/itemProps3.xml><?xml version="1.0" encoding="utf-8"?>
+<ds:datastoreItem xmlns:ds="http://schemas.openxmlformats.org/officeDocument/2006/customXml" ds:itemID="{D34E9049-C4C4-4525-A905-9C0938917599}">
+  <ds:schemaRefs>
+    <ds:schemaRef ds:uri="http://schemas.microsoft.com/sharepoint/v3/contenttype/forms"/>
+  </ds:schemaRefs>
+</ds:datastoreItem>
 </file>
</xml_diff>